<commit_message>
feat: update lab02 reports with detailed cost estimations and new visualizations
</commit_message>
<xml_diff>
--- a/lab02/llm-bench/docs/relatorio-piloto.docx
+++ b/lab02/llm-bench/docs/relatorio-piloto.docx
@@ -4451,9 +4451,9 @@
       <w:r>
         <w:drawing>
           <wp:inline distT="0" distB="0" distL="0" distR="0">
-            <wp:extent cx="5715000" cy="1962150"/>
+            <wp:extent cx="5715000" cy="2183130"/>
             <wp:effectExtent t="0" r="0" b="0" l="0"/>
-            <wp:docPr id="1" name="piloto-custo-estimado.png" descr="Figura 4. Custo estimado pelo preço público de API (não é o valor pago)." title="Figura 4. Custo estimado pelo preço público de API (não é o valor pago)."/>
+            <wp:docPr id="1" name="piloto-custo-estimado.png" descr="Figura 4. Custo estimado pelo preço público de API (não é o valor pago), dividido em entrada nova, cache lido e saída mais raciocínio." title="Figura 4. Custo estimado pelo preço público de API (não é o valor pago), dividido em entrada nova, cache lido e saída mais raciocínio."/>
             <wp:cNvGraphicFramePr>
               <a:graphicFrameLocks xmlns:a="http://schemas.openxmlformats.org/drawingml/2006/main" noChangeAspect="1"/>
             </wp:cNvGraphicFramePr>
@@ -4476,7 +4476,7 @@
                   <pic:spPr bwMode="auto">
                     <a:xfrm>
                       <a:off x="0" y="0"/>
-                      <a:ext cx="5715000" cy="1962150"/>
+                      <a:ext cx="5715000" cy="2183130"/>
                     </a:xfrm>
                     <a:prstGeom prst="rect">
                       <a:avLst/>
@@ -4502,7 +4502,7 @@
           <w:sz w:val="18"/>
           <w:szCs w:val="18"/>
         </w:rPr>
-        <w:t xml:space="preserve">Figura 4. Custo estimado pelo preço público de API (não é o valor pago).</w:t>
+        <w:t xml:space="preserve">Figura 4. Custo estimado pelo preço público de API (não é o valor pago), dividido em entrada nova, cache lido e saída mais raciocínio.</w:t>
       </w:r>
     </w:p>
     <w:p>

</xml_diff>